<commit_message>
updated authentication code for ajo technical account
</commit_message>
<xml_diff>
--- a/SYSTEM_REFERENCE.docx
+++ b/SYSTEM_REFERENCE.docx
@@ -5001,7 +5001,7 @@
         <w:spacing w:after="80"/>
       </w:pPr>
       <w:r>
-        <w:t xml:space="preserve">Backend calls Adobe IMS POST /ims/token/v3 → gets access_token + expires_in</w:t>
+        <w:t xml:space="preserve">Backend calls Adobe IMS POST /ims/token/v3 → gets access_token + expires_in (in seconds — do NOT divide by 1000)</w:t>
       </w:r>
     </w:p>
     <w:p>
@@ -5014,7 +5014,7 @@
         <w:spacing w:after="80"/>
       </w:pPr>
       <w:r>
-        <w:t xml:space="preserve">(if expires_in &gt; 86400 → divide by 1000: IMS sometimes returns ms)</w:t>
+        <w:t xml:space="preserve">Saves encrypted_access_token, encrypted_credentials, token_expires_at to source_connections (no session_token or security_token)</w:t>
       </w:r>
     </w:p>
     <w:p>
@@ -5027,7 +5027,7 @@
         <w:spacing w:after="80"/>
       </w:pPr>
       <w:r>
-        <w:t xml:space="preserve">Backend calls ACC SOAP xtk:session#BearerTokenLogon with the IMS access_token</w:t>
+        <w:t xml:space="preserve">Creates user_sessions row (7-day rolling TTL)</w:t>
       </w:r>
     </w:p>
     <w:p>
@@ -5040,46 +5040,27 @@
         <w:spacing w:after="80"/>
       </w:pPr>
       <w:r>
-        <w:t xml:space="preserve">→ gets session_token + security_token (proper ACC SOAP tokens, works identically to classic)</w:t>
-      </w:r>
-    </w:p>
-    <w:p>
-      <w:pPr>
-        <w:pStyle w:val="ListParagraph"/>
-        <w:numPr>
-          <w:ilvl w:val="0"/>
-          <w:numId w:val="2"/>
-        </w:numPr>
-        <w:spacing w:after="80"/>
-      </w:pPr>
-      <w:r>
-        <w:t xml:space="preserve">Saves session_token, security_token, encrypted_access_token, encrypted_credentials, token_expires_at to source_connections</w:t>
-      </w:r>
-    </w:p>
-    <w:p>
-      <w:pPr>
-        <w:pStyle w:val="ListParagraph"/>
-        <w:numPr>
-          <w:ilvl w:val="0"/>
-          <w:numId w:val="2"/>
-        </w:numPr>
-        <w:spacing w:after="80"/>
-      </w:pPr>
-      <w:r>
-        <w:t xml:space="preserve">Creates user_sessions row (7-day rolling TTL)</w:t>
-      </w:r>
-    </w:p>
-    <w:p>
-      <w:pPr>
-        <w:pStyle w:val="ListParagraph"/>
-        <w:numPr>
-          <w:ilvl w:val="0"/>
-          <w:numId w:val="2"/>
-        </w:numPr>
-        <w:spacing w:after="80"/>
-      </w:pPr>
-      <w:r>
         <w:t xml:space="preserve">Sets acc_session cookie (httponly, 7 days)</w:t>
+      </w:r>
+    </w:p>
+    <w:p>
+      <w:pPr>
+        <w:spacing w:after="120"/>
+      </w:pPr>
+    </w:p>
+    <w:p>
+      <w:pPr>
+        <w:spacing w:after="120"/>
+      </w:pPr>
+      <w:r>
+        <w:rPr>
+          <w:b/>
+          <w:bCs/>
+        </w:rPr>
+        <w:t xml:space="preserve">Modern bearer flow: </w:t>
+      </w:r>
+      <w:r>
+        <w:t xml:space="preserve">All SOAP calls for technical auth send Authorization: Bearer &lt;access_token&gt; in the HTTP header with an empty sessiontoken in the SOAP envelope. The helper acc_soap_headers(conn, token) returns the correct headers per auth type — routes never branch on auth_type.</w:t>
       </w:r>
     </w:p>
     <w:p>
@@ -5114,7 +5095,7 @@
           <w:sz w:val="18"/>
           <w:szCs w:val="18"/>
         </w:rPr>
-        <w:t xml:space="preserve">If token_expires_at &gt; now + 60s: return conn.session_token  (SOAP session still valid)</w:t>
+        <w:t xml:space="preserve">If token_expires_at &gt; now + 60s: return decrypt(encrypted_access_token)  (IMS token still valid)</w:t>
       </w:r>
     </w:p>
     <w:p>
@@ -5150,25 +5131,7 @@
           <w:sz w:val="18"/>
           <w:szCs w:val="18"/>
         </w:rPr>
-        <w:t xml:space="preserve">      POST ACC xtk:session#BearerTokenLogon → new session_token + security_token</w:t>
-      </w:r>
-    </w:p>
-    <w:p>
-      <w:pPr>
-        <w:pBdr>
-          <w:left w:val="single" w:color="0066CC" w:sz="6" w:space="6"/>
-        </w:pBdr>
-        <w:spacing w:after="60"/>
-        <w:ind w:left="360"/>
-      </w:pPr>
-      <w:r>
-        <w:rPr>
-          <w:rFonts w:ascii="Courier New" w:cs="Courier New" w:eastAsia="Courier New" w:hAnsi="Courier New"/>
-          <w:color w:val="1A1A2E"/>
-          <w:sz w:val="18"/>
-          <w:szCs w:val="18"/>
-        </w:rPr>
-        <w:t xml:space="preserve">      UPDATE source_connections SET session_token, security_token, encrypted_access_token, token_expires_at</w:t>
+        <w:t xml:space="preserve">      UPDATE source_connections SET encrypted_access_token, token_expires_at</w:t>
       </w:r>
     </w:p>
     <w:p>
@@ -5433,7 +5396,7 @@
         <w:spacing w:after="120"/>
       </w:pPr>
       <w:r>
-        <w:t xml:space="preserve">Technical: token = conn.session_token  (from BearerTokenLogon; IMS-refreshed + re-BearerLogon'd if token_expires_at passed)</w:t>
+        <w:t xml:space="preserve">Technical: token = decrypt(encrypted_access_token)  (IMS-refreshed if token_expires_at passed)</w:t>
       </w:r>
     </w:p>
     <w:p>
@@ -5441,7 +5404,7 @@
         <w:spacing w:after="120"/>
       </w:pPr>
       <w:r>
-        <w:t xml:space="preserve">In both cases routes and SOAP envelope builders are identical — no auth-type branching needed downstream.</w:t>
+        <w:t xml:space="preserve">Routes call acc_soap_headers(conn, token): technical returns Authorization: Bearer, classic returns Cookie + X-Security-Token. No auth-type branching needed in SOAP envelope builders.</w:t>
       </w:r>
     </w:p>
     <w:p>
@@ -13385,116 +13348,13 @@
         <w:spacing w:after="120"/>
       </w:pPr>
       <w:r>
-        <w:rPr>
-          <w:b w:val="false"/>
-          <w:bCs w:val="false"/>
-        </w:rPr>
-        <w:t xml:space="preserve">Hybrid strategy: PATH A uses already-extracted DB data (fast, no SOAP). PATH B fetches live from ACC SOAP when DB is empty.</w:t>
+        <w:t xml:space="preserve">Always uses live ACC SOAP. A DB-only approach was considered but rejected — users extract only a subset of schemas, so the DB would miss dependencies for schemas never selected for extraction, silently showing dependent schemas as selectable.</w:t>
       </w:r>
     </w:p>
     <w:p>
       <w:pPr>
         <w:spacing w:after="120"/>
       </w:pPr>
-    </w:p>
-    <w:p>
-      <w:pPr>
-        <w:pStyle w:val="Heading3"/>
-      </w:pPr>
-      <w:r>
-        <w:t xml:space="preserve">PATH A — DB (post-extraction, fast)</w:t>
-      </w:r>
-    </w:p>
-    <w:p>
-      <w:pPr>
-        <w:pStyle w:val="ListParagraph"/>
-        <w:numPr>
-          <w:ilvl w:val="0"/>
-          <w:numId w:val="2"/>
-        </w:numPr>
-        <w:spacing w:after="80"/>
-      </w:pPr>
-      <w:r>
-        <w:t xml:space="preserve">Authenticate: get_login_from_cookie() → login_id</w:t>
-      </w:r>
-    </w:p>
-    <w:p>
-      <w:pPr>
-        <w:pStyle w:val="ListParagraph"/>
-        <w:numPr>
-          <w:ilvl w:val="0"/>
-          <w:numId w:val="2"/>
-        </w:numPr>
-        <w:spacing w:after="80"/>
-      </w:pPr>
-      <w:r>
-        <w:t xml:space="preserve">SELECT converted_schemas WHERE login_id = ? → if rows exist, use them</w:t>
-      </w:r>
-    </w:p>
-    <w:p>
-      <w:pPr>
-        <w:pStyle w:val="ListParagraph"/>
-        <w:numPr>
-          <w:ilvl w:val="0"/>
-          <w:numId w:val="2"/>
-        </w:numPr>
-        <w:spacing w:after="80"/>
-      </w:pPr>
-      <w:r>
-        <w:t xml:space="preserve">all_names = { row.schema_name for row in rows }</w:t>
-      </w:r>
-    </w:p>
-    <w:p>
-      <w:pPr>
-        <w:pStyle w:val="ListParagraph"/>
-        <w:numPr>
-          <w:ilvl w:val="0"/>
-          <w:numId w:val="2"/>
-        </w:numPr>
-        <w:spacing w:after="80"/>
-      </w:pPr>
-      <w:r>
-        <w:t xml:space="preserve">For each row: load raw_json → read linksAndJoins array</w:t>
-      </w:r>
-    </w:p>
-    <w:p>
-      <w:pPr>
-        <w:pStyle w:val="ListParagraph"/>
-        <w:numPr>
-          <w:ilvl w:val="0"/>
-          <w:numId w:val="2"/>
-        </w:numPr>
-        <w:spacing w:after="80"/>
-      </w:pPr>
-      <w:r>
-        <w:t xml:space="preserve">For each link where targetSchema in all_names: dependents_of[target].append(row.schema_name), dependent_set.add(row.schema_name)</w:t>
-      </w:r>
-    </w:p>
-    <w:p>
-      <w:pPr>
-        <w:pStyle w:val="ListParagraph"/>
-        <w:numPr>
-          <w:ilvl w:val="0"/>
-          <w:numId w:val="2"/>
-        </w:numPr>
-        <w:spacing w:after="80"/>
-      </w:pPr>
-      <w:r>
-        <w:t xml:space="preserve">Return immediately — zero SOAP calls</w:t>
-      </w:r>
-    </w:p>
-    <w:p>
-      <w:pPr>
-        <w:spacing w:after="120"/>
-      </w:pPr>
-    </w:p>
-    <w:p>
-      <w:pPr>
-        <w:pStyle w:val="Heading3"/>
-      </w:pPr>
-      <w:r>
-        <w:t xml:space="preserve">PATH B — SOAP fallback (pre-extraction)</w:t>
-      </w:r>
     </w:p>
     <w:tbl>
       <w:tblPr>
@@ -13701,7 +13561,7 @@
                 <w:sz w:val="18"/>
                 <w:szCs w:val="18"/>
               </w:rPr>
-              <w:t xml:space="preserve">SELECT source_connections WHERE login_id = ? → get_valid_acc_token(conn, db)</w:t>
+              <w:t xml:space="preserve">get_login_from_cookie() → login_id. SELECT source_connections WHERE login_id = ? → get_valid_acc_token(conn, db)</w:t>
             </w:r>
           </w:p>
         </w:tc>
@@ -13986,7 +13846,7 @@
                 <w:sz w:val="18"/>
                 <w:szCs w:val="18"/>
               </w:rPr>
-              <w:t xml:space="preserve">For each schema_key with FK links to other custom schemas: dependents_of[target].append(schema_key), dependent_set.add(schema_key)</w:t>
+              <w:t xml:space="preserve">For each link where targetSchema namespace is not a system namespace: dependents_of[target].append(schema_key), dependent_set.add(schema_key)</w:t>
             </w:r>
           </w:p>
         </w:tc>
@@ -14081,7 +13941,7 @@
                 <w:sz w:val="18"/>
                 <w:szCs w:val="18"/>
               </w:rPr>
-              <w:t xml:space="preserve">{ dependents_of: {...}, dependent_set: [...] } — computed fresh, not persisted</w:t>
+              <w:t xml:space="preserve">{ dependents_of: {...}, dependent_set: [...] } — not stored in DB, computed fresh on every page load</w:t>
             </w:r>
           </w:p>
         </w:tc>
@@ -14105,7 +13965,7 @@
         <w:spacing w:after="120"/>
       </w:pPr>
       <w:r>
-        <w:t xml:space="preserve">Auth: acc_session cookie → login_id via get_login_from_cookie(). No body.</w:t>
+        <w:t xml:space="preserve">Auth: acc_session cookie → login_id via get_login_from_cookie(). No body. No DB write.</w:t>
       </w:r>
     </w:p>
     <w:p>
@@ -14113,15 +13973,7 @@
         <w:spacing w:after="120"/>
       </w:pPr>
       <w:r>
-        <w:t xml:space="preserve">PATH A (DB): reads converted_schemas.raw_json.linksAndJoins — no SOAP calls.</w:t>
-      </w:r>
-    </w:p>
-    <w:p>
-      <w:pPr>
-        <w:spacing w:after="120"/>
-      </w:pPr>
-      <w:r>
-        <w:t xml:space="preserve">PATH B (SOAP): ACC SOAP calls made:</w:t>
+        <w:t xml:space="preserve">ACC SOAP calls made:</w:t>
       </w:r>
     </w:p>
     <w:p>

</xml_diff>